<commit_message>
Remove non-offensive services from catalogue
Removed 5 services out of scope for an offensive-focused practice:
- Physical security assessment
- Assumed breach / purple team exercise
- DevSecOps and CI/CD pipeline security review
- Ransomware preparedness assessment
- Third-party and vendor security assessment

Retained services: web app, API, mobile, SaaS, AI/LLM, thick-client,
network VA, internal network pentest, AD/identity, Wi-Fi, cloud config,
firewall/WAF review, secure code review/SAST, SCA, DAST, threat
modelling, secure architecture review, remediation support, OSINT/attack
surface management, and security awareness training.

Co-Authored-By: Claude Sonnet 4.6 <noreply@anthropic.com>
Claude-Session: https://claude.ai/code/session_015c4sruf5YsTgRhEGjDPCL8
</commit_message>
<xml_diff>
--- a/cybersecurity_services_catalogue_v0.2.docx
+++ b/cybersecurity_services_catalogue_v0.2.docx
@@ -786,155 +786,25 @@
         <w:pStyle w:val="Heading2"/>
       </w:pPr>
       <w:r>
-        <w:t>Physical security assessment</w:t>
+        <w:t>Attack surface management and OSINT review</w:t>
       </w:r>
     </w:p>
     <w:p>
       <w:pPr/>
       <w:r>
-        <w:t>Typical scope: Named premises, entry points, server rooms, reception areas and agreed locations, conducted during a defined time window with documented emergency contacts.</w:t>
+        <w:t>Typical scope: Publicly available information about the named organisation: domains, IP ranges, exposed services, employee data, credential leaks, code repositories and third-party data sources, using only passive and authorised active techniques.</w:t>
       </w:r>
     </w:p>
     <w:p>
       <w:pPr/>
       <w:r>
-        <w:t>Coverage: Physical access controls, badge/RFID security, tailgating and piggybacking exposure, server room and wiring-closet access, clear-desk and screen-lock practices, visitor management, physical document disposal, CCTV coverage gaps and social engineering through physical presence where explicitly authorised.</w:t>
+        <w:t>Coverage: Domain and subdomain enumeration, exposed ports and services, certificate transparency, leaked credentials and data in breach databases (checked against known lists only), code and secret exposure in public repositories, employee exposure via social/professional networks, misconfigured cloud storage, and technologies fingerprintable from public responses.</w:t>
       </w:r>
     </w:p>
     <w:p>
       <w:pPr/>
       <w:r>
-        <w:t>Deliverable: Location and scope coverage, findings with photographic or log evidence as agreed, risk rating, and recommended controls. Exclude techniques not in the Rules of Engagement. Destructive bypass or alarm-triggering require separate written approval.</w:t>
-      </w:r>
-    </w:p>
-    <w:p>
-      <w:pPr>
-        <w:pStyle w:val="Heading2"/>
-      </w:pPr>
-      <w:r>
-        <w:t>Assumed breach / purple team exercise</w:t>
-      </w:r>
-    </w:p>
-    <w:p>
-      <w:pPr/>
-      <w:r>
-        <w:t>Typical scope: Named internal environment, defined initial access point or credential set, agreed attack objectives, and client detection-and-response team participation.</w:t>
-      </w:r>
-    </w:p>
-    <w:p>
-      <w:pPr/>
-      <w:r>
-        <w:t>Coverage: Simulated lateral movement, privilege escalation, credential access, persistence attempts, and data-exfiltration simulation within agreed boundaries; defence-team detection coverage, alert quality, and response timing against each scenario.</w:t>
-      </w:r>
-    </w:p>
-    <w:p>
-      <w:pPr/>
-      <w:r>
-        <w:t>Deliverable: Attack-path narrative, defence visibility matrix (detected / alerted / missed), findings, risk context, and recommended improvements to detection rules, logging, and response runbooks. Define scenario objectives, exclusions and safe-stop conditions before the exercise.</w:t>
-      </w:r>
-    </w:p>
-    <w:p>
-      <w:pPr>
-        <w:pStyle w:val="Heading2"/>
-      </w:pPr>
-      <w:r>
-        <w:t>Attack surface management and OSINT review</w:t>
-      </w:r>
-    </w:p>
-    <w:p>
-      <w:pPr/>
-      <w:r>
-        <w:t>Typical scope: Publicly available information about the named organisation: domains, IP ranges, exposed services, employee data, credential leaks, code repositories and third-party data sources, using only passive and authorised active techniques.</w:t>
-      </w:r>
-    </w:p>
-    <w:p>
-      <w:pPr/>
-      <w:r>
-        <w:t>Coverage: Domain and subdomain enumeration, exposed ports and services, certificate transparency, leaked credentials and data in breach databases (checked against known lists only), code and secret exposure in public repositories, employee exposure via social/professional networks, misconfigured cloud storage, and technologies fingerprintable from public responses.</w:t>
-      </w:r>
-    </w:p>
-    <w:p>
-      <w:pPr/>
-      <w:r>
         <w:t>Deliverable: External attack surface inventory, prioritised exposure findings, evidence of discovered assets, remediation guidance, and a note on data sources used. Credential checks use only publicly available breach data and do not attempt live authentication without separate authorisation.</w:t>
-      </w:r>
-    </w:p>
-    <w:p>
-      <w:pPr>
-        <w:pStyle w:val="Heading2"/>
-      </w:pPr>
-      <w:r>
-        <w:t>DevSecOps and CI/CD pipeline security review</w:t>
-      </w:r>
-    </w:p>
-    <w:p>
-      <w:pPr/>
-      <w:r>
-        <w:t>Typical scope: Named CI/CD pipelines, build systems, deployment tooling, infrastructure-as-code repositories, container registries, and related secrets management, with read access to configuration and pipeline definitions.</w:t>
-      </w:r>
-    </w:p>
-    <w:p>
-      <w:pPr/>
-      <w:r>
-        <w:t>Coverage: Pipeline configuration and access controls, secret and credential handling in pipeline definitions and environment variables, image and dependency provenance, code-signing and artefact integrity, deployment authorisation and approval gates, least-privilege service accounts, separation between environments, SAST/SCA/DAST integration in the pipeline, supply-chain risks in build dependencies, and infrastructure-as-code security.</w:t>
-      </w:r>
-    </w:p>
-    <w:p>
-      <w:pPr/>
-      <w:r>
-        <w:t>Deliverable: Findings register tied to pipeline or repository path, risk rating, and recommended controls. State clearly which pipelines, registries and IaC repositories were reviewed. Configuration changes require separate client approval.</w:t>
-      </w:r>
-    </w:p>
-    <w:p>
-      <w:pPr>
-        <w:pStyle w:val="Heading2"/>
-      </w:pPr>
-      <w:r>
-        <w:t>Ransomware preparedness assessment</w:t>
-      </w:r>
-    </w:p>
-    <w:p>
-      <w:pPr/>
-      <w:r>
-        <w:t>Typical scope: Named environment, backup systems, network architecture, endpoint configuration, identity environment and incident response plans, reviewed via document analysis and agreed technical checks.</w:t>
-      </w:r>
-    </w:p>
-    <w:p>
-      <w:pPr/>
-      <w:r>
-        <w:t>Coverage: Backup integrity, segmentation and offline/immutable backup availability, domain and identity hygiene relevant to ransomware propagation, endpoint protection and detection controls, privileged access and lateral-movement exposure, email and web filtering, patch and vulnerability posture, incident response and recovery runbook review, and business-continuity gap analysis.</w:t>
-      </w:r>
-    </w:p>
-    <w:p>
-      <w:pPr/>
-      <w:r>
-        <w:t>Deliverable: Preparedness findings, risk-prioritised remediation roadmap, backup and recovery gap summary, and recommendations. This is a preparedness review, not a simulation exercise; ransomware detonation or live destructive testing is explicitly excluded unless separately scoped and authorised in writing.</w:t>
-      </w:r>
-    </w:p>
-    <w:p>
-      <w:pPr>
-        <w:pStyle w:val="Heading2"/>
-      </w:pPr>
-      <w:r>
-        <w:t>Third-party and vendor security assessment</w:t>
-      </w:r>
-    </w:p>
-    <w:p>
-      <w:pPr/>
-      <w:r>
-        <w:t>Typical scope: Named third-party or supplier, assessed via questionnaire, document review, public information and agreed evidence requests; no direct testing of the vendor's systems without explicit written permission from the vendor.</w:t>
-      </w:r>
-    </w:p>
-    <w:p>
-      <w:pPr/>
-      <w:r>
-        <w:t>Coverage: Security questionnaire against a defined framework (e.g. SIG Lite, CSA CAIQ, or custom), review of the vendor's certifications (ISO 27001, SOC 2), data handling and breach notification processes, subprocessor and supply-chain exposure, access controls for data shared with the vendor, contractual and exit-management provisions, and incident response history where disclosed.</w:t>
-      </w:r>
-    </w:p>
-    <w:p>
-      <w:pPr/>
-      <w:r>
-        <w:t>Deliverable: Vendor risk score and summary, findings register, evidence reviewed, open questions requiring vendor response, and recommended contractual or technical controls. Scope is limited to documentation and public information unless the vendor grants direct access in writing.</w:t>
       </w:r>
     </w:p>
     <w:p>

</xml_diff>